<commit_message>
rebuilding site Tue May 26 08:07:31 IST 2026
</commit_message>
<xml_diff>
--- a/resume.docx
+++ b/resume.docx
@@ -145,7 +145,7 @@
           <w:color w:val="444444"/>
           <w:rtl w:val="0"/>
         </w:rPr>
-        <w:t xml:space="preserve">Senior security engineer, 4+ years formal experience, 8+ years in security and open source. Co-creator of SupplyShield (BlackHat Arsenal 3x — EU 2023, MEA 2024, Asia 2025) and Open Source Summit NA speaker. Published CVEs in cpp-httplib, co-maintainer of VulnerableCode, co-drafted the vers specification alongside Package-URL. Deep experience building DevSecOps programs, hardening CI/CD against supply chain attacks, and performing code-level reviews across Python, Java, and Go.</w:t>
+        <w:t xml:space="preserve">Senior security engineer, nearly 5 years of professional experience. Co-creator of SupplyShield (BlackHat Arsenal 3x — EU 2023, MEA 2024, Asia 2025) and Open Source Summit NA speaker. Published CVEs in cpp-httplib, co-maintainer of VulnerableCode, co-drafted the vers specification. Deep experience building DevSecOps programs, hardening CI/CD against supply chain attacks, and performing code-level reviews across Python, Java, and Go.</w:t>
       </w:r>
     </w:p>
     <w:p>
@@ -999,7 +999,7 @@
           <w:color w:val="444444"/>
           <w:rtl w:val="0"/>
         </w:rPr>
-        <w:t xml:space="preserve">Co-drafted the vers specification, a universal way to parse and compare package versions across ecosystems, alongside Package-URL (PURL), emerging as industry standards for dependency and vulnerability identification.</w:t>
+        <w:t xml:space="preserve">Co-drafted the vers specification, a universal way to parse and compare package versions across ecosystems, a sister project of Package-URL (PURL), emerging as industry standards for dependency and vulnerability identification.</w:t>
       </w:r>
     </w:p>
     <w:p>

</xml_diff>